<commit_message>
commit -m "Update manuscript files for candidatura"
</commit_message>
<xml_diff>
--- a/candidatura/manuscript/carta.docx
+++ b/candidatura/manuscript/carta.docx
@@ -4,66 +4,54 @@
   <w:body>
     <w:p>
       <w:pPr>
-        <w:pStyle w:val="Title"/>
-      </w:pPr>
-      <w:r>
-        <w:t xml:space="preserve">Carta de Motivação</w:t>
+        <w:pStyle w:val="FirstParagraph"/>
+      </w:pPr>
+      <w:r>
+        <w:t xml:space="preserve">Durante um workshop em Portugal, ao jogar água numa terra vermelha, senti o cheiro de terra molhada que me remeteu imediatamente aos dias de verão na casa da minha avó em Minas Gerais. Quando partilhei essa lembrança com uma colega de Guiné-Bissau, ela respondeu animada:</w:t>
+      </w:r>
+      <w:r>
+        <w:t xml:space="preserve"> </w:t>
+      </w:r>
+      <w:r>
+        <w:t xml:space="preserve">“Eu também!”</w:t>
+      </w:r>
+      <w:r>
+        <w:t xml:space="preserve"> </w:t>
+      </w:r>
+      <w:r>
+        <w:t xml:space="preserve">Duas pessoas de continentes diferentes, com histórias completamente distintas — e o mesmo gesto abriu simultaneamente duas infâncias, dois territórios, duas memórias corporais. Foi nesse momento que percebi que o que me interessa não é apenas o barro como material, mas o que ele é capaz de evocar: sentidos e conhecimentos que, sem o contacto material, permanecem inacessíveis.</w:t>
       </w:r>
     </w:p>
     <w:p>
       <w:pPr>
-        <w:pStyle w:val="Subtitle"/>
-      </w:pPr>
-      <w:r>
-        <w:t xml:space="preserve">Doutoramento em História, Filosofia e Património da Ciência e da Tecnologia</w:t>
+        <w:pStyle w:val="BodyText"/>
+      </w:pPr>
+      <w:r>
+        <w:t xml:space="preserve">A minha trajectória até esta candidatura não é linear, mas revela uma continuidade progressiva entre prática artística, investigação material e reflexão teórica. Formei-me em Arquitectura e Urbanismo no Rio de Janeiro, passei por Quioto, onde o contacto com a cerâmica japonesa reorientou profundamente o meu percurso, e instalei-me posteriormente em Nova Friburgo, na região serrana do Rio de Janeiro, onde mantive um ateliê de cerâmica durante vários anos.</w:t>
       </w:r>
     </w:p>
     <w:p>
       <w:pPr>
-        <w:pStyle w:val="Author"/>
-      </w:pPr>
-      <w:r>
-        <w:t xml:space="preserve">Gustavo Teodoro de Assis</w:t>
+        <w:pStyle w:val="BodyText"/>
+      </w:pPr>
+      <w:r>
+        <w:t xml:space="preserve">Quando me candidatei ao Mestrado em Arte e Ciência do Vidro e da Cerâmica na VICARTE — Universidade NOVA de Lisboa — sabia que queria aprofundar a minha prática. O que não sabia era que o mestrado me conduziria a uma questão diferente: que o que me interessa não é apenas fazer, mas pensar através do fazer — incluindo as formas de conhecimento que emergem em práticas colectivas e materiais.</w:t>
       </w:r>
     </w:p>
     <w:p>
       <w:pPr>
-        <w:pStyle w:val="Date"/>
-      </w:pPr>
-      <w:r>
-        <w:t xml:space="preserve">19 de maio de 2026</w:t>
+        <w:pStyle w:val="BodyText"/>
+      </w:pPr>
+      <w:r>
+        <w:t xml:space="preserve">Foi essa descoberta que abriu o doutoramento como necessidade e não apenas como ambição.</w:t>
       </w:r>
     </w:p>
     <w:p>
       <w:pPr>
-        <w:pStyle w:val="FirstParagraph"/>
-      </w:pPr>
-      <w:r>
-        <w:t xml:space="preserve">A minha trajectória até esta candidatura não é linear, mas revela uma continuidade progressiva entre prática artística, investigação material e reflexão teórica. Formei-me em Arquitectura e Urbanismo no Rio de Janeiro, passei por Quioto, onde o contacto com a cerâmica japonesa reorientou profundamente o meu percurso, e instalei-me posteriormente em Nova Friburgo, na região serrana do Rio de Janeiro, onde mantive um ateliê de cerâmica durante vários anos.</w:t>
-      </w:r>
-    </w:p>
-    <w:p>
-      <w:pPr>
         <w:pStyle w:val="BodyText"/>
       </w:pPr>
       <w:r>
-        <w:t xml:space="preserve">Quando me candidatei ao Mestrado em Arte e Ciência do Vidro e da Cerâmica na VICARTE — Universidade NOVA de Lisboa — sabia que queria aprofundar a minha prática. O que não sabia era que o mestrado me conduziria a uma questão diferente: que o que me interessa não é apenas fazer, mas pensar através do fazer — incluindo as formas de conhecimento que emergem em práticas colectivas e materiais.</w:t>
-      </w:r>
-    </w:p>
-    <w:p>
-      <w:pPr>
-        <w:pStyle w:val="BodyText"/>
-      </w:pPr>
-      <w:r>
-        <w:t xml:space="preserve">Foi essa descoberta que abriu o doutoramento como necessidade e não apenas como ambição.</w:t>
-      </w:r>
-    </w:p>
-    <w:p>
-      <w:pPr>
-        <w:pStyle w:val="BodyText"/>
-      </w:pPr>
-      <w:r>
-        <w:t xml:space="preserve">A minha dissertação de mestrado centrou-se em práticas colectivas de construção com barro e terra, e os temas que emergiram ao longo da investigação — cuidado, materialidade, agenciamento colectivo e conhecimento situado — revelaram-se demasiado amplos para serem plenamente desenvolvidos no espaço e no tempo de um mestrado. No momento em que concluí a investigação, senti claramente que não estava a encerrar um percurso, mas a identificar o ponto de partida de outro. O doutoramento surge, assim, como a continuação natural desse processo — não por inércia, mas porque as questões que permaneceram em aberto exigem um enquadramento mais amplo, métodos mais desenvolvidos e um diálogo teórico mais aprofundado com os novos materialismos, a antropologia da prática e a filosofia da técnica.</w:t>
+        <w:t xml:space="preserve">A minha dissertação de mestrado centrou-se em práticas colectivas de construção com barro e terra. Foi durante essa investigação que li Torto Arado, de Itamar Vieira Junior, e encontrei algo que não esperava: as casas de barro construídas em mutirão por comunidades quilombolas aparecem no romance como instrumento de uma violência estrutural — os fazendeiros exigiam esse tipo de construção precisamente porque ela não constitui prova de propriedade. O mesmo material que sustenta formas de cuidado e de memória colectiva é usado pelo poder como evidência de que aquela gente não pertence àquele lugar. Percebi então que o barro não é apenas portador de sentido — é campo de disputa. E que os temas que emergiram ao longo da investigação — cuidado, materialidade, agenciamento colectivo e conhecimento situado — eram demasiado amplos para serem plenamente desenvolvidos no espaço e no tempo de um mestrado. No momento em que concluí a investigação, senti claramente que não estava a encerrar um percurso, mas a identificar o ponto de partida de outro. O doutoramento surge, assim, como a continuação natural desse processo — não por inércia, mas porque as questões que permaneceram em aberto exigem um enquadramento mais amplo, métodos mais desenvolvidos e um diálogo teórico mais aprofundado com os novos materialismos, a antropologia da prática e a filosofia da técnica.</w:t>
       </w:r>
     </w:p>
     <w:p>

</xml_diff>